<commit_message>
Fix square brackets manually
</commit_message>
<xml_diff>
--- a/bank/task_09/variant_12.docx
+++ b/bank/task_09/variant_12.docx
@@ -146,6 +146,32 @@
         </w:rPr>
       </w:pPr>
       <m:oMath>
+        <m:d>
+          <m:dPr>
+            <m:begChr m:val="["/>
+            <m:endChr m:val=""/>
+            <m:ctrlPr>
+              <w:rPr>
+                <w:rFonts w:ascii="Cambria Math" w:eastAsia="Times New Roman" w:hAnsi="Cambria Math"/>
+                <w:i/>
+                <w:szCs w:val="28"/>
+                <w:bdr w:val="none" w:sz="0" w:space="0" w:color="auto" w:frame="1"/>
+                <w:lang w:eastAsia="ru-RU"/>
+              </w:rPr>
+            </m:ctrlPr>
+          </m:dPr>
+          <m:e>
+            <m:r>
+              <w:rPr>
+                <w:rFonts w:ascii="Cambria Math" w:eastAsia="Times New Roman" w:hAnsi="Cambria Math"/>
+                <w:szCs w:val="28"/>
+                <w:bdr w:val="none" w:sz="0" w:space="0" w:color="auto" w:frame="1"/>
+                <w:lang w:eastAsia="ru-RU"/>
+              </w:rPr>
+              <m:t>0</m:t>
+            </m:r>
+          </m:e>
+        </m:d>
         <m:r>
           <w:rPr>
             <w:rFonts w:ascii="Cambria Math" w:eastAsia="Times New Roman" w:hAnsi="Cambria Math"/>
@@ -153,8 +179,34 @@
             <w:bdr w:val="none" w:sz="0" w:space="0" w:color="auto" w:frame="1"/>
             <w:lang w:eastAsia="ru-RU"/>
           </w:rPr>
-          <m:t>[0;4]</m:t>
+          <m:t>;</m:t>
         </m:r>
+        <m:d>
+          <m:dPr>
+            <m:begChr m:val=""/>
+            <m:endChr m:val="]"/>
+            <m:ctrlPr>
+              <w:rPr>
+                <w:rFonts w:ascii="Cambria Math" w:eastAsia="Times New Roman" w:hAnsi="Cambria Math"/>
+                <w:i/>
+                <w:szCs w:val="28"/>
+                <w:bdr w:val="none" w:sz="0" w:space="0" w:color="auto" w:frame="1"/>
+                <w:lang w:eastAsia="ru-RU"/>
+              </w:rPr>
+            </m:ctrlPr>
+          </m:dPr>
+          <m:e>
+            <m:r>
+              <w:rPr>
+                <w:rFonts w:ascii="Cambria Math" w:eastAsia="Times New Roman" w:hAnsi="Cambria Math"/>
+                <w:szCs w:val="28"/>
+                <w:bdr w:val="none" w:sz="0" w:space="0" w:color="auto" w:frame="1"/>
+                <w:lang w:eastAsia="ru-RU"/>
+              </w:rPr>
+              <m:t>4</m:t>
+            </m:r>
+          </m:e>
+        </m:d>
       </m:oMath>
     </w:p>
     <w:p>

</xml_diff>